<commit_message>
Remove IDE ignores; update uploaded docx
Delete IDE-specific ignore entries (.metadata/, .settings/, .plugins/, *.prefs) from .gitignore under the VS Code section, and replace/update the binary upload at uploads/academic/3/doc_1.docx. No functional code changes.
</commit_message>
<xml_diff>
--- a/shopping-cart-spring-boot-main/uploads/academic/3/doc_1.docx
+++ b/shopping-cart-spring-boot-main/uploads/academic/3/doc_1.docx
@@ -485,7 +485,7 @@
                 <w:sz w:val="28"/>
                 <w:b w:val="off"/>
               </w:rPr>
-              <w:t>☑</w:t>
+              <w:t>✔️</w:t>
             </w:r>
           </w:p>
         </w:tc>
@@ -509,7 +509,7 @@
                 <w:sz w:val="28"/>
                 <w:b w:val="off"/>
               </w:rPr>
-              <w:t>☑</w:t>
+              <w:t/>
             </w:r>
           </w:p>
         </w:tc>
@@ -533,7 +533,7 @@
                 <w:sz w:val="28"/>
                 <w:b w:val="off"/>
               </w:rPr>
-              <w:t>นนนนนนนนนนนนนนนนนนนนนนนนนนนนนนนนนนนนนนนนนนนนนนนนนนนนนนนนนนนนนนนนนนนนนนนนนนนนนนนนนนนนนนนนนนนนนนนนนนนนนนนนนนนนนนนนนนนนนนนนนนนน</w:t>
+              <w:t/>
             </w:r>
           </w:p>
         </w:tc>
@@ -636,7 +636,7 @@
                 <w:sz w:val="28"/>
                 <w:b w:val="off"/>
               </w:rPr>
-              <w:t>☑</w:t>
+              <w:t>✔️</w:t>
             </w:r>
           </w:p>
         </w:tc>
@@ -660,7 +660,7 @@
                 <w:sz w:val="28"/>
                 <w:b w:val="off"/>
               </w:rPr>
-              <w:t>☑</w:t>
+              <w:t/>
             </w:r>
           </w:p>
         </w:tc>
@@ -797,7 +797,7 @@
                 <w:sz w:val="28"/>
                 <w:b w:val="off"/>
               </w:rPr>
-              <w:t>☑</w:t>
+              <w:t>✔️</w:t>
             </w:r>
           </w:p>
         </w:tc>
@@ -821,7 +821,7 @@
                 <w:sz w:val="28"/>
                 <w:b w:val="off"/>
               </w:rPr>
-              <w:t>☑</w:t>
+              <w:t/>
             </w:r>
           </w:p>
         </w:tc>
@@ -968,7 +968,7 @@
                 <w:sz w:val="28"/>
                 <w:b w:val="off"/>
               </w:rPr>
-              <w:t>☐</w:t>
+              <w:t>✔️</w:t>
             </w:r>
           </w:p>
         </w:tc>
@@ -992,7 +992,7 @@
                 <w:sz w:val="28"/>
                 <w:b w:val="off"/>
               </w:rPr>
-              <w:t>☑</w:t>
+              <w:t/>
             </w:r>
           </w:p>
         </w:tc>
@@ -1016,7 +1016,7 @@
                 <w:sz w:val="28"/>
                 <w:b w:val="off"/>
               </w:rPr>
-              <w:t>gyukgukygttydtjgfyujgihiuj</w:t>
+              <w:t/>
             </w:r>
           </w:p>
         </w:tc>
@@ -1119,7 +1119,7 @@
                 <w:sz w:val="28"/>
                 <w:b w:val="off"/>
               </w:rPr>
-              <w:t>☑</w:t>
+              <w:t>✔️</w:t>
             </w:r>
           </w:p>
         </w:tc>
@@ -1143,7 +1143,7 @@
                 <w:sz w:val="28"/>
                 <w:b w:val="off"/>
               </w:rPr>
-              <w:t>☑</w:t>
+              <w:t/>
             </w:r>
           </w:p>
         </w:tc>
@@ -1220,7 +1220,7 @@
           <w:sz w:val="32"/>
           <w:b w:val="off"/>
         </w:rPr>
-        <w:t xml:space="preserve">     (ดัรเ้รี)				(นางสาวจิราภรณ์  หอมอ่อน)</w:t>
+        <w:t xml:space="preserve">     (เกรียงไกร)				(นางสาวจิราภรณ์  หอมอ่อน)</w:t>
       </w:r>
     </w:p>
     <w:p>

</xml_diff>